<commit_message>
Updated portfolio with new experience and focus
</commit_message>
<xml_diff>
--- a/public/NoahPNResume2025.docx
+++ b/public/NoahPNResume2025.docx
@@ -26,17 +26,10 @@
     <w:p>
       <w:pPr>
         <w:spacing w:after="120"/>
-        <w:rPr>
-          <w:rFonts w:ascii="Cambria" w:hAnsi="Cambria" w:cs="Calibri"/>
-          <w:sz w:val="20"/>
-          <w:szCs w:val="20"/>
-        </w:rPr>
-      </w:pPr>
-      <w:r>
-        <w:rPr>
-          <w:rFonts w:ascii="Cambria" w:hAnsi="Cambria" w:cs="Calibri"/>
-          <w:sz w:val="20"/>
-          <w:szCs w:val="20"/>
+      </w:pPr>
+      <w:r>
+        <w:rPr>
+          <w:rFonts w:ascii="Cambria" w:hAnsi="Cambria" w:cs="Calibri"/>
         </w:rPr>
         <w:t xml:space="preserve">Ottawa, ON | (778) 388-8144 | </w:t>
       </w:r>
@@ -45,8 +38,6 @@
           <w:rPr>
             <w:rStyle w:val="Hyperlink"/>
             <w:rFonts w:ascii="Cambria" w:hAnsi="Cambria" w:cs="Calibri"/>
-            <w:sz w:val="20"/>
-            <w:szCs w:val="20"/>
           </w:rPr>
           <w:t>noahparknguyen@gmail.com</w:t>
         </w:r>
@@ -54,8 +45,6 @@
       <w:r>
         <w:rPr>
           <w:rFonts w:ascii="Cambria" w:hAnsi="Cambria" w:cs="Calibri"/>
-          <w:sz w:val="20"/>
-          <w:szCs w:val="20"/>
         </w:rPr>
         <w:t xml:space="preserve"> | </w:t>
       </w:r>
@@ -64,8 +53,6 @@
           <w:rPr>
             <w:rStyle w:val="Hyperlink"/>
             <w:rFonts w:ascii="Cambria" w:hAnsi="Cambria" w:cs="Calibri"/>
-            <w:sz w:val="20"/>
-            <w:szCs w:val="20"/>
           </w:rPr>
           <w:t>LinkedIn</w:t>
         </w:r>
@@ -73,8 +60,6 @@
       <w:r>
         <w:rPr>
           <w:rFonts w:ascii="Cambria" w:hAnsi="Cambria" w:cs="Calibri"/>
-          <w:sz w:val="20"/>
-          <w:szCs w:val="20"/>
         </w:rPr>
         <w:t xml:space="preserve"> | </w:t>
       </w:r>
@@ -83,8 +68,6 @@
           <w:rPr>
             <w:rStyle w:val="Hyperlink"/>
             <w:rFonts w:ascii="Cambria" w:hAnsi="Cambria" w:cs="Calibri"/>
-            <w:sz w:val="20"/>
-            <w:szCs w:val="20"/>
           </w:rPr>
           <w:t>GitHub</w:t>
         </w:r>
@@ -92,8 +75,6 @@
       <w:r>
         <w:rPr>
           <w:rFonts w:ascii="Cambria" w:hAnsi="Cambria" w:cs="Calibri"/>
-          <w:sz w:val="20"/>
-          <w:szCs w:val="20"/>
         </w:rPr>
         <w:t xml:space="preserve"> | </w:t>
       </w:r>
@@ -102,8 +83,6 @@
           <w:rPr>
             <w:rStyle w:val="Hyperlink"/>
             <w:rFonts w:ascii="Cambria" w:hAnsi="Cambria" w:cs="Calibri"/>
-            <w:sz w:val="20"/>
-            <w:szCs w:val="20"/>
           </w:rPr>
           <w:t>Portfolio</w:t>
         </w:r>
@@ -119,13 +98,66 @@
           <w:rFonts w:ascii="Cambria" w:hAnsi="Cambria" w:cs="Calibri"/>
           <w:b/>
           <w:bCs/>
-        </w:rPr>
-      </w:pPr>
-      <w:r>
-        <w:rPr>
-          <w:rFonts w:ascii="Cambria" w:hAnsi="Cambria" w:cs="Calibri"/>
-          <w:b/>
-          <w:bCs/>
+          <w:sz w:val="24"/>
+          <w:szCs w:val="24"/>
+        </w:rPr>
+      </w:pPr>
+      <w:r>
+        <w:rPr>
+          <w:rFonts w:ascii="Cambria" w:hAnsi="Cambria" w:cs="Calibri"/>
+          <w:b/>
+          <w:bCs/>
+          <w:sz w:val="24"/>
+          <w:szCs w:val="24"/>
+        </w:rPr>
+        <w:t>S</w:t>
+      </w:r>
+      <w:r>
+        <w:rPr>
+          <w:rFonts w:ascii="Cambria" w:hAnsi="Cambria" w:cs="Calibri"/>
+          <w:b/>
+          <w:bCs/>
+          <w:sz w:val="24"/>
+          <w:szCs w:val="24"/>
+        </w:rPr>
+        <w:t>ummary</w:t>
+      </w:r>
+    </w:p>
+    <w:p>
+      <w:pPr>
+        <w:spacing w:after="120"/>
+        <w:rPr>
+          <w:rFonts w:ascii="Cambria" w:hAnsi="Cambria" w:cs="Calibri"/>
+        </w:rPr>
+      </w:pPr>
+      <w:r>
+        <w:rPr>
+          <w:rFonts w:ascii="Cambria" w:hAnsi="Cambria" w:cs="Calibri"/>
+        </w:rPr>
+        <w:t>Application Developer with one year of experience designing and supporting internal solutions for federal departments (DND, FINTRAC). Proficient in the Microsoft Power Platform (Power Apps, Power BI, Power Automate) and full-stack development with React, Node.js, and Java. Experienced in leveraging Azure DevOps and Agile/Scrum frameworks to deliver secure, automated, and data-driven solutions that improve efficiency and collaboration.</w:t>
+      </w:r>
+    </w:p>
+    <w:p>
+      <w:pPr>
+        <w:pBdr>
+          <w:bottom w:val="single" w:sz="6" w:space="1" w:color="auto"/>
+        </w:pBdr>
+        <w:spacing w:after="120"/>
+        <w:rPr>
+          <w:rFonts w:ascii="Cambria" w:hAnsi="Cambria" w:cs="Calibri"/>
+          <w:b/>
+          <w:bCs/>
+          <w:sz w:val="24"/>
+          <w:szCs w:val="24"/>
+        </w:rPr>
+      </w:pPr>
+      <w:r>
+        <w:rPr>
+          <w:rFonts w:ascii="Cambria" w:hAnsi="Cambria" w:cs="Calibri"/>
+          <w:b/>
+          <w:bCs/>
+          <w:sz w:val="24"/>
+          <w:szCs w:val="24"/>
         </w:rPr>
         <w:t>Skills</w:t>
       </w:r>
@@ -141,45 +173,19 @@
         <w:contextualSpacing w:val="0"/>
         <w:rPr>
           <w:rFonts w:ascii="Cambria" w:hAnsi="Cambria" w:cs="Calibri"/>
-          <w:sz w:val="20"/>
-          <w:szCs w:val="20"/>
-        </w:rPr>
-      </w:pPr>
-      <w:r>
-        <w:rPr>
-          <w:rFonts w:ascii="Cambria" w:hAnsi="Cambria" w:cs="Calibri"/>
-          <w:b/>
-          <w:bCs/>
-          <w:sz w:val="20"/>
-          <w:szCs w:val="20"/>
-        </w:rPr>
-        <w:t>Front</w:t>
-      </w:r>
-      <w:r>
-        <w:rPr>
-          <w:rFonts w:ascii="Cambria" w:hAnsi="Cambria" w:cs="Calibri"/>
-          <w:b/>
-          <w:bCs/>
-          <w:sz w:val="20"/>
-          <w:szCs w:val="20"/>
-        </w:rPr>
-        <w:t>-E</w:t>
-      </w:r>
-      <w:r>
-        <w:rPr>
-          <w:rFonts w:ascii="Cambria" w:hAnsi="Cambria" w:cs="Calibri"/>
-          <w:b/>
-          <w:bCs/>
-          <w:sz w:val="20"/>
-          <w:szCs w:val="20"/>
-        </w:rPr>
-        <w:t>nd</w:t>
-      </w:r>
-      <w:r>
-        <w:rPr>
-          <w:rFonts w:ascii="Cambria" w:hAnsi="Cambria" w:cs="Calibri"/>
-          <w:sz w:val="20"/>
-          <w:szCs w:val="20"/>
+        </w:rPr>
+      </w:pPr>
+      <w:r>
+        <w:rPr>
+          <w:rFonts w:ascii="Cambria" w:hAnsi="Cambria" w:cs="Calibri"/>
+          <w:b/>
+          <w:bCs/>
+        </w:rPr>
+        <w:t>Front-End</w:t>
+      </w:r>
+      <w:r>
+        <w:rPr>
+          <w:rFonts w:ascii="Cambria" w:hAnsi="Cambria" w:cs="Calibri"/>
         </w:rPr>
         <w:t>: React, Tailwind CSS, HTML5, CSS3, JavaScript</w:t>
       </w:r>
@@ -195,17 +201,13 @@
         <w:contextualSpacing w:val="0"/>
         <w:rPr>
           <w:rFonts w:ascii="Cambria" w:hAnsi="Cambria" w:cs="Calibri"/>
-          <w:sz w:val="20"/>
-          <w:szCs w:val="20"/>
-        </w:rPr>
-      </w:pPr>
-      <w:r>
-        <w:rPr>
-          <w:rFonts w:ascii="Cambria" w:hAnsi="Cambria" w:cs="Calibri"/>
-          <w:b/>
-          <w:bCs/>
-          <w:sz w:val="20"/>
-          <w:szCs w:val="20"/>
+        </w:rPr>
+      </w:pPr>
+      <w:r>
+        <w:rPr>
+          <w:rFonts w:ascii="Cambria" w:hAnsi="Cambria" w:cs="Calibri"/>
+          <w:b/>
+          <w:bCs/>
         </w:rPr>
         <w:t>Back</w:t>
       </w:r>
@@ -214,8 +216,6 @@
           <w:rFonts w:ascii="Cambria" w:hAnsi="Cambria" w:cs="Calibri"/>
           <w:b/>
           <w:bCs/>
-          <w:sz w:val="20"/>
-          <w:szCs w:val="20"/>
         </w:rPr>
         <w:t>-E</w:t>
       </w:r>
@@ -224,18 +224,20 @@
           <w:rFonts w:ascii="Cambria" w:hAnsi="Cambria" w:cs="Calibri"/>
           <w:b/>
           <w:bCs/>
-          <w:sz w:val="20"/>
-          <w:szCs w:val="20"/>
         </w:rPr>
         <w:t>nd</w:t>
       </w:r>
       <w:r>
         <w:rPr>
           <w:rFonts w:ascii="Cambria" w:hAnsi="Cambria" w:cs="Calibri"/>
-          <w:sz w:val="20"/>
-          <w:szCs w:val="20"/>
-        </w:rPr>
-        <w:t>: Node.js, Express, MongoDB, Java, Spring Boot</w:t>
+        </w:rPr>
+        <w:t xml:space="preserve">: </w:t>
+      </w:r>
+      <w:r>
+        <w:rPr>
+          <w:rFonts w:ascii="Cambria" w:hAnsi="Cambria" w:cs="Calibri"/>
+        </w:rPr>
+        <w:t>Node.js, Express, MongoDB, Java, Spring Boot</w:t>
       </w:r>
     </w:p>
     <w:p>
@@ -249,27 +251,21 @@
         <w:contextualSpacing w:val="0"/>
         <w:rPr>
           <w:rFonts w:ascii="Cambria" w:hAnsi="Cambria" w:cs="Calibri"/>
-          <w:sz w:val="20"/>
-          <w:szCs w:val="20"/>
-        </w:rPr>
-      </w:pPr>
-      <w:r>
-        <w:rPr>
-          <w:rFonts w:ascii="Cambria" w:hAnsi="Cambria" w:cs="Calibri"/>
-          <w:b/>
-          <w:bCs/>
-          <w:sz w:val="20"/>
-          <w:szCs w:val="20"/>
-        </w:rPr>
-        <w:t>Tools</w:t>
-      </w:r>
-      <w:r>
-        <w:rPr>
-          <w:rFonts w:ascii="Cambria" w:hAnsi="Cambria" w:cs="Calibri"/>
-          <w:sz w:val="20"/>
-          <w:szCs w:val="20"/>
-        </w:rPr>
-        <w:t>: Visual Studio Code, IntelliJ IDEA, Apache Maven, Eclipse</w:t>
+        </w:rPr>
+      </w:pPr>
+      <w:r>
+        <w:rPr>
+          <w:rFonts w:ascii="Cambria" w:hAnsi="Cambria" w:cs="Calibri"/>
+          <w:b/>
+          <w:bCs/>
+        </w:rPr>
+        <w:t>Power Platform</w:t>
+      </w:r>
+      <w:r>
+        <w:rPr>
+          <w:rFonts w:ascii="Cambria" w:hAnsi="Cambria" w:cs="Calibri"/>
+        </w:rPr>
+        <w:t>: Power Apps, Power Automate, Power BI, Dataverse</w:t>
       </w:r>
     </w:p>
     <w:p>
@@ -283,27 +279,35 @@
         <w:contextualSpacing w:val="0"/>
         <w:rPr>
           <w:rFonts w:ascii="Cambria" w:hAnsi="Cambria" w:cs="Calibri"/>
-          <w:sz w:val="20"/>
-          <w:szCs w:val="20"/>
-        </w:rPr>
-      </w:pPr>
-      <w:r>
-        <w:rPr>
-          <w:rFonts w:ascii="Cambria" w:hAnsi="Cambria" w:cs="Calibri"/>
-          <w:b/>
-          <w:bCs/>
-          <w:sz w:val="20"/>
-          <w:szCs w:val="20"/>
-        </w:rPr>
-        <w:t>Collaboration</w:t>
-      </w:r>
-      <w:r>
-        <w:rPr>
-          <w:rFonts w:ascii="Cambria" w:hAnsi="Cambria" w:cs="Calibri"/>
-          <w:sz w:val="20"/>
-          <w:szCs w:val="20"/>
-        </w:rPr>
-        <w:t>: Git, GitHub, Microsoft Azure DevOps, Agile/Scrum, Microsoft Office Suite</w:t>
+        </w:rPr>
+      </w:pPr>
+      <w:r>
+        <w:rPr>
+          <w:rFonts w:ascii="Cambria" w:hAnsi="Cambria" w:cs="Calibri"/>
+          <w:b/>
+          <w:bCs/>
+        </w:rPr>
+        <w:t>Collaboration &amp; Development Tools</w:t>
+      </w:r>
+      <w:r>
+        <w:rPr>
+          <w:rFonts w:ascii="Cambria" w:hAnsi="Cambria" w:cs="Calibri"/>
+        </w:rPr>
+        <w:t>:</w:t>
+      </w:r>
+      <w:r>
+        <w:rPr>
+          <w:rFonts w:ascii="Cambria" w:hAnsi="Cambria" w:cs="Calibri"/>
+          <w:b/>
+          <w:bCs/>
+        </w:rPr>
+        <w:t xml:space="preserve"> </w:t>
+      </w:r>
+      <w:r>
+        <w:rPr>
+          <w:rFonts w:ascii="Cambria" w:hAnsi="Cambria" w:cs="Calibri"/>
+        </w:rPr>
+        <w:t>Visual Studio Code, Azure DevOps, Git, Agile/Scrum, Microsoft Office Suite (Outlook, Teams, SharePoint)</w:t>
       </w:r>
     </w:p>
     <w:p>
@@ -318,25 +322,19 @@
         <w:contextualSpacing w:val="0"/>
         <w:rPr>
           <w:rFonts w:ascii="Cambria" w:hAnsi="Cambria" w:cs="Calibri"/>
-          <w:sz w:val="20"/>
-          <w:szCs w:val="20"/>
-        </w:rPr>
-      </w:pPr>
-      <w:r>
-        <w:rPr>
-          <w:rFonts w:ascii="Cambria" w:hAnsi="Cambria" w:cs="Calibri"/>
-          <w:b/>
-          <w:bCs/>
-          <w:sz w:val="20"/>
-          <w:szCs w:val="20"/>
+        </w:rPr>
+      </w:pPr>
+      <w:r>
+        <w:rPr>
+          <w:rFonts w:ascii="Cambria" w:hAnsi="Cambria" w:cs="Calibri"/>
+          <w:b/>
+          <w:bCs/>
         </w:rPr>
         <w:t>Languages</w:t>
       </w:r>
       <w:r>
         <w:rPr>
           <w:rFonts w:ascii="Cambria" w:hAnsi="Cambria" w:cs="Calibri"/>
-          <w:sz w:val="20"/>
-          <w:szCs w:val="20"/>
         </w:rPr>
         <w:t>: English (native), French (conversational)</w:t>
       </w:r>
@@ -351,13 +349,17 @@
           <w:rFonts w:ascii="Cambria" w:hAnsi="Cambria" w:cs="Calibri"/>
           <w:b/>
           <w:bCs/>
-        </w:rPr>
-      </w:pPr>
-      <w:r>
-        <w:rPr>
-          <w:rFonts w:ascii="Cambria" w:hAnsi="Cambria" w:cs="Calibri"/>
-          <w:b/>
-          <w:bCs/>
+          <w:sz w:val="24"/>
+          <w:szCs w:val="24"/>
+        </w:rPr>
+      </w:pPr>
+      <w:r>
+        <w:rPr>
+          <w:rFonts w:ascii="Cambria" w:hAnsi="Cambria" w:cs="Calibri"/>
+          <w:b/>
+          <w:bCs/>
+          <w:sz w:val="24"/>
+          <w:szCs w:val="24"/>
         </w:rPr>
         <w:t>Experience</w:t>
       </w:r>
@@ -369,55 +371,51 @@
         </w:tabs>
         <w:rPr>
           <w:rFonts w:ascii="Cambria" w:hAnsi="Cambria" w:cs="Calibri"/>
-          <w:sz w:val="20"/>
-          <w:szCs w:val="20"/>
-        </w:rPr>
-      </w:pPr>
-      <w:r>
-        <w:rPr>
-          <w:rFonts w:ascii="Cambria" w:hAnsi="Cambria" w:cs="Calibri"/>
-          <w:b/>
-          <w:bCs/>
-          <w:sz w:val="20"/>
-          <w:szCs w:val="20"/>
-        </w:rPr>
-        <w:t xml:space="preserve">Algonquin College </w:t>
-      </w:r>
-      <w:r>
-        <w:rPr>
-          <w:rFonts w:ascii="Cambria" w:hAnsi="Cambria" w:cs="Calibri"/>
-          <w:b/>
-          <w:bCs/>
-          <w:sz w:val="20"/>
-          <w:szCs w:val="20"/>
-        </w:rPr>
-        <w:t>|</w:t>
-      </w:r>
-      <w:r>
-        <w:rPr>
-          <w:rFonts w:ascii="Cambria" w:hAnsi="Cambria" w:cs="Calibri"/>
-          <w:b/>
-          <w:bCs/>
-          <w:sz w:val="20"/>
-          <w:szCs w:val="20"/>
-        </w:rPr>
-        <w:t xml:space="preserve"> Student Tester</w:t>
-      </w:r>
-      <w:r>
-        <w:rPr>
-          <w:rFonts w:ascii="Cambria" w:hAnsi="Cambria" w:cs="Calibri"/>
-          <w:b/>
-          <w:bCs/>
-          <w:sz w:val="20"/>
-          <w:szCs w:val="20"/>
+        </w:rPr>
+      </w:pPr>
+      <w:r>
+        <w:rPr>
+          <w:rFonts w:ascii="Cambria" w:hAnsi="Cambria" w:cs="Calibri"/>
+          <w:b/>
+          <w:bCs/>
+        </w:rPr>
+        <w:t>Department of National Defence (DND)</w:t>
+      </w:r>
+      <w:r>
+        <w:rPr>
+          <w:rFonts w:ascii="Cambria" w:hAnsi="Cambria" w:cs="Calibri"/>
+          <w:b/>
+          <w:bCs/>
+        </w:rPr>
+        <w:t xml:space="preserve"> </w:t>
+      </w:r>
+      <w:r>
+        <w:rPr>
+          <w:rFonts w:ascii="Cambria" w:hAnsi="Cambria" w:cs="Calibri"/>
+          <w:b/>
+          <w:bCs/>
+        </w:rPr>
+        <w:t xml:space="preserve">| </w:t>
+      </w:r>
+      <w:r>
+        <w:rPr>
+          <w:rFonts w:ascii="Cambria" w:hAnsi="Cambria" w:cs="Calibri"/>
+          <w:b/>
+          <w:bCs/>
+        </w:rPr>
+        <w:t>Developer</w:t>
+      </w:r>
+      <w:r>
+        <w:rPr>
+          <w:rFonts w:ascii="Cambria" w:hAnsi="Cambria" w:cs="Calibri"/>
+          <w:b/>
+          <w:bCs/>
         </w:rPr>
         <w:t xml:space="preserve"> | Ottawa, ON</w:t>
       </w:r>
       <w:r>
         <w:rPr>
           <w:rFonts w:ascii="Cambria" w:hAnsi="Cambria" w:cs="Calibri"/>
-          <w:sz w:val="20"/>
-          <w:szCs w:val="20"/>
         </w:rPr>
         <w:tab/>
       </w:r>
@@ -426,10 +424,40 @@
           <w:rFonts w:ascii="Cambria" w:hAnsi="Cambria" w:cs="Calibri"/>
           <w:i/>
           <w:iCs/>
-          <w:sz w:val="20"/>
-          <w:szCs w:val="20"/>
-        </w:rPr>
-        <w:t>Jan 2024 – Apr 2024</w:t>
+        </w:rPr>
+        <w:t>Feb</w:t>
+      </w:r>
+      <w:r>
+        <w:rPr>
+          <w:rFonts w:ascii="Cambria" w:hAnsi="Cambria" w:cs="Calibri"/>
+          <w:i/>
+          <w:iCs/>
+        </w:rPr>
+        <w:t xml:space="preserve"> 202</w:t>
+      </w:r>
+      <w:r>
+        <w:rPr>
+          <w:rFonts w:ascii="Cambria" w:hAnsi="Cambria" w:cs="Calibri"/>
+          <w:i/>
+          <w:iCs/>
+        </w:rPr>
+        <w:t>5</w:t>
+      </w:r>
+      <w:r>
+        <w:rPr>
+          <w:rFonts w:ascii="Cambria" w:hAnsi="Cambria" w:cs="Calibri"/>
+          <w:i/>
+          <w:iCs/>
+        </w:rPr>
+        <w:t xml:space="preserve"> – </w:t>
+      </w:r>
+      <w:r>
+        <w:rPr>
+          <w:rFonts w:ascii="Cambria" w:hAnsi="Cambria" w:cs="Calibri"/>
+          <w:i/>
+          <w:iCs/>
+        </w:rPr>
+        <w:t>Present</w:t>
       </w:r>
     </w:p>
     <w:p>
@@ -446,41 +474,19 @@
         <w:contextualSpacing w:val="0"/>
         <w:rPr>
           <w:rFonts w:ascii="Cambria" w:hAnsi="Cambria" w:cs="Calibri"/>
-          <w:sz w:val="20"/>
-          <w:szCs w:val="20"/>
-        </w:rPr>
-      </w:pPr>
-      <w:r>
-        <w:rPr>
-          <w:rFonts w:ascii="Cambria" w:hAnsi="Cambria" w:cs="Calibri"/>
-          <w:sz w:val="20"/>
-          <w:szCs w:val="20"/>
-        </w:rPr>
-        <w:t>Developed a Java automation tool that updated API documentation</w:t>
-      </w:r>
-      <w:r>
-        <w:rPr>
-          <w:rFonts w:ascii="Cambria" w:hAnsi="Cambria" w:cs="Calibri"/>
-          <w:sz w:val="20"/>
-          <w:szCs w:val="20"/>
-        </w:rPr>
-        <w:t xml:space="preserve">, </w:t>
-      </w:r>
-      <w:r>
-        <w:rPr>
-          <w:rFonts w:ascii="Cambria" w:hAnsi="Cambria" w:cs="Calibri"/>
-          <w:sz w:val="20"/>
-          <w:szCs w:val="20"/>
-        </w:rPr>
-        <w:t>cutting</w:t>
-      </w:r>
-      <w:r>
-        <w:rPr>
-          <w:rFonts w:ascii="Cambria" w:hAnsi="Cambria" w:cs="Calibri"/>
-          <w:sz w:val="20"/>
-          <w:szCs w:val="20"/>
-        </w:rPr>
-        <w:t xml:space="preserve"> 8+ hours of manual effort per update.</w:t>
+        </w:rPr>
+      </w:pPr>
+      <w:r>
+        <w:rPr>
+          <w:rFonts w:ascii="Cambria" w:hAnsi="Cambria" w:cs="Calibri"/>
+        </w:rPr>
+        <w:t>Developed a responsive web interface in React and Tailwind CSS for an internal AI chatbot, enabling natural-language querying of a 400+ page policy document</w:t>
+      </w:r>
+      <w:r>
+        <w:rPr>
+          <w:rFonts w:ascii="Cambria" w:hAnsi="Cambria" w:cs="Calibri"/>
+        </w:rPr>
+        <w:t>.</w:t>
       </w:r>
     </w:p>
     <w:p>
@@ -497,25 +503,13 @@
         <w:contextualSpacing w:val="0"/>
         <w:rPr>
           <w:rFonts w:ascii="Cambria" w:hAnsi="Cambria" w:cs="Calibri"/>
-          <w:sz w:val="20"/>
-          <w:szCs w:val="20"/>
-        </w:rPr>
-      </w:pPr>
-      <w:r>
-        <w:rPr>
-          <w:rFonts w:ascii="Cambria" w:hAnsi="Cambria" w:cs="Calibri"/>
-          <w:sz w:val="20"/>
-          <w:szCs w:val="20"/>
-        </w:rPr>
-        <w:t>Built an automated system to detect and update outdated API data, streamlining documentation maintenance</w:t>
-      </w:r>
-      <w:r>
-        <w:rPr>
-          <w:rFonts w:ascii="Cambria" w:hAnsi="Cambria" w:cs="Calibri"/>
-          <w:sz w:val="20"/>
-          <w:szCs w:val="20"/>
-        </w:rPr>
-        <w:t>.</w:t>
+        </w:rPr>
+      </w:pPr>
+      <w:r>
+        <w:rPr>
+          <w:rFonts w:ascii="Cambria" w:hAnsi="Cambria" w:cs="Calibri"/>
+        </w:rPr>
+        <w:t>Designed and deployed an interactive Power BI dashboard visualizing course completion data, fiscal-year growth, and delivery method trends.</w:t>
       </w:r>
     </w:p>
     <w:p>
@@ -532,17 +526,13 @@
         <w:contextualSpacing w:val="0"/>
         <w:rPr>
           <w:rFonts w:ascii="Cambria" w:hAnsi="Cambria" w:cs="Calibri"/>
-          <w:sz w:val="20"/>
-          <w:szCs w:val="20"/>
-        </w:rPr>
-      </w:pPr>
-      <w:r>
-        <w:rPr>
-          <w:rFonts w:ascii="Cambria" w:hAnsi="Cambria" w:cs="Calibri"/>
-          <w:sz w:val="20"/>
-          <w:szCs w:val="20"/>
-        </w:rPr>
-        <w:t>Resolved 50+ bugs in Azure DevOps, improving system stability and reducing errors in the team’s workflow.</w:t>
+        </w:rPr>
+      </w:pPr>
+      <w:r>
+        <w:rPr>
+          <w:rFonts w:ascii="Cambria" w:hAnsi="Cambria" w:cs="Calibri"/>
+        </w:rPr>
+        <w:t>Built a Power App–based project tracking system integrated with Power Automate to streamline client onboarding—automating Teams channel creation, folder setup, and developer notifications.</w:t>
       </w:r>
     </w:p>
     <w:p>
@@ -560,41 +550,13 @@
         <w:contextualSpacing w:val="0"/>
         <w:rPr>
           <w:rFonts w:ascii="Cambria" w:hAnsi="Cambria" w:cs="Calibri"/>
-          <w:sz w:val="20"/>
-          <w:szCs w:val="20"/>
-        </w:rPr>
-      </w:pPr>
-      <w:r>
-        <w:rPr>
-          <w:rFonts w:ascii="Cambria" w:hAnsi="Cambria" w:cs="Calibri"/>
-          <w:sz w:val="20"/>
-          <w:szCs w:val="20"/>
-        </w:rPr>
-        <w:t xml:space="preserve">Wrote </w:t>
-      </w:r>
-      <w:r>
-        <w:rPr>
-          <w:rFonts w:ascii="Cambria" w:hAnsi="Cambria" w:cs="Calibri"/>
-          <w:sz w:val="20"/>
-          <w:szCs w:val="20"/>
-        </w:rPr>
-        <w:t xml:space="preserve">tests with </w:t>
-      </w:r>
-      <w:r>
-        <w:rPr>
-          <w:rFonts w:ascii="Cambria" w:hAnsi="Cambria" w:cs="Calibri"/>
-          <w:sz w:val="20"/>
-          <w:szCs w:val="20"/>
-        </w:rPr>
-        <w:t>Junit-5 to confirm form logic, increasing test coverage by 20% and improving application reliability</w:t>
-      </w:r>
-      <w:r>
-        <w:rPr>
-          <w:rFonts w:ascii="Cambria" w:hAnsi="Cambria" w:cs="Calibri"/>
-          <w:sz w:val="20"/>
-          <w:szCs w:val="20"/>
-        </w:rPr>
-        <w:t>.</w:t>
+        </w:rPr>
+      </w:pPr>
+      <w:r>
+        <w:rPr>
+          <w:rFonts w:ascii="Cambria" w:hAnsi="Cambria" w:cs="Calibri"/>
+        </w:rPr>
+        <w:t>Collaborated in Agile sprints using Azure DevOps for task tracking, documentation, and iterative feature delivery.</w:t>
       </w:r>
     </w:p>
     <w:p>
@@ -604,35 +566,43 @@
         </w:tabs>
         <w:rPr>
           <w:rFonts w:ascii="Cambria" w:hAnsi="Cambria" w:cs="Calibri"/>
-          <w:sz w:val="20"/>
-          <w:szCs w:val="20"/>
-        </w:rPr>
-      </w:pPr>
-      <w:r>
-        <w:rPr>
-          <w:rFonts w:ascii="Cambria" w:hAnsi="Cambria" w:cs="Calibri"/>
-          <w:b/>
-          <w:bCs/>
-          <w:sz w:val="20"/>
-          <w:szCs w:val="20"/>
-        </w:rPr>
-        <w:t>FINTRAC | Application Developer</w:t>
-      </w:r>
-      <w:r>
-        <w:rPr>
-          <w:rFonts w:ascii="Cambria" w:hAnsi="Cambria" w:cs="Calibri"/>
-          <w:b/>
-          <w:bCs/>
-          <w:sz w:val="20"/>
-          <w:szCs w:val="20"/>
+        </w:rPr>
+      </w:pPr>
+      <w:r>
+        <w:rPr>
+          <w:rFonts w:ascii="Cambria" w:hAnsi="Cambria" w:cs="Calibri"/>
+          <w:b/>
+          <w:bCs/>
+        </w:rPr>
+        <w:t xml:space="preserve">Algonquin College </w:t>
+      </w:r>
+      <w:r>
+        <w:rPr>
+          <w:rFonts w:ascii="Cambria" w:hAnsi="Cambria" w:cs="Calibri"/>
+          <w:b/>
+          <w:bCs/>
+        </w:rPr>
+        <w:t>|</w:t>
+      </w:r>
+      <w:r>
+        <w:rPr>
+          <w:rFonts w:ascii="Cambria" w:hAnsi="Cambria" w:cs="Calibri"/>
+          <w:b/>
+          <w:bCs/>
+        </w:rPr>
+        <w:t xml:space="preserve"> Student Tester</w:t>
+      </w:r>
+      <w:r>
+        <w:rPr>
+          <w:rFonts w:ascii="Cambria" w:hAnsi="Cambria" w:cs="Calibri"/>
+          <w:b/>
+          <w:bCs/>
         </w:rPr>
         <w:t xml:space="preserve"> | Ottawa, ON</w:t>
       </w:r>
       <w:r>
         <w:rPr>
           <w:rFonts w:ascii="Cambria" w:hAnsi="Cambria" w:cs="Calibri"/>
-          <w:sz w:val="20"/>
-          <w:szCs w:val="20"/>
         </w:rPr>
         <w:tab/>
       </w:r>
@@ -641,10 +611,32 @@
           <w:rFonts w:ascii="Cambria" w:hAnsi="Cambria" w:cs="Calibri"/>
           <w:i/>
           <w:iCs/>
-          <w:sz w:val="20"/>
-          <w:szCs w:val="20"/>
-        </w:rPr>
-        <w:t>Sep 2024 – Dec 2024</w:t>
+        </w:rPr>
+        <w:t>Sep</w:t>
+      </w:r>
+      <w:r>
+        <w:rPr>
+          <w:rFonts w:ascii="Cambria" w:hAnsi="Cambria" w:cs="Calibri"/>
+          <w:i/>
+          <w:iCs/>
+        </w:rPr>
+        <w:t xml:space="preserve"> 2024 – </w:t>
+      </w:r>
+      <w:r>
+        <w:rPr>
+          <w:rFonts w:ascii="Cambria" w:hAnsi="Cambria" w:cs="Calibri"/>
+          <w:i/>
+          <w:iCs/>
+        </w:rPr>
+        <w:t>Dec</w:t>
+      </w:r>
+      <w:r>
+        <w:rPr>
+          <w:rFonts w:ascii="Cambria" w:hAnsi="Cambria" w:cs="Calibri"/>
+          <w:i/>
+          <w:iCs/>
+        </w:rPr>
+        <w:t xml:space="preserve"> 2024</w:t>
       </w:r>
     </w:p>
     <w:p>
@@ -652,26 +644,22 @@
         <w:pStyle w:val="ListParagraph"/>
         <w:numPr>
           <w:ilvl w:val="0"/>
-          <w:numId w:val="3"/>
+          <w:numId w:val="2"/>
         </w:numPr>
         <w:tabs>
-          <w:tab w:val="left" w:pos="8789"/>
+          <w:tab w:val="left" w:pos="8931"/>
         </w:tabs>
         <w:ind w:left="426"/>
         <w:contextualSpacing w:val="0"/>
         <w:rPr>
           <w:rFonts w:ascii="Cambria" w:hAnsi="Cambria" w:cs="Calibri"/>
-          <w:sz w:val="20"/>
-          <w:szCs w:val="20"/>
-        </w:rPr>
-      </w:pPr>
-      <w:r>
-        <w:rPr>
-          <w:rFonts w:ascii="Cambria" w:hAnsi="Cambria" w:cs="Calibri"/>
-          <w:sz w:val="20"/>
-          <w:szCs w:val="20"/>
-        </w:rPr>
-        <w:t>Authored 100+ test cases for the R3 project, covering data management, system responsiveness, and role-based access.</w:t>
+        </w:rPr>
+      </w:pPr>
+      <w:r>
+        <w:rPr>
+          <w:rFonts w:ascii="Cambria" w:hAnsi="Cambria" w:cs="Calibri"/>
+        </w:rPr>
+        <w:t>Authored and executed 100+ test cases for the R3 student information system, covering access control, data integrity, and responsiveness.</w:t>
       </w:r>
     </w:p>
     <w:p>
@@ -679,70 +667,40 @@
         <w:pStyle w:val="ListParagraph"/>
         <w:numPr>
           <w:ilvl w:val="0"/>
-          <w:numId w:val="3"/>
+          <w:numId w:val="2"/>
         </w:numPr>
         <w:tabs>
-          <w:tab w:val="left" w:pos="8789"/>
+          <w:tab w:val="left" w:pos="8931"/>
         </w:tabs>
         <w:ind w:left="426"/>
         <w:contextualSpacing w:val="0"/>
         <w:rPr>
           <w:rFonts w:ascii="Cambria" w:hAnsi="Cambria" w:cs="Calibri"/>
-          <w:sz w:val="20"/>
-          <w:szCs w:val="20"/>
-        </w:rPr>
-      </w:pPr>
-      <w:r>
-        <w:rPr>
-          <w:rFonts w:ascii="Cambria" w:hAnsi="Cambria" w:cs="Calibri"/>
-          <w:sz w:val="20"/>
-          <w:szCs w:val="20"/>
-        </w:rPr>
-        <w:t xml:space="preserve">Executed 200+ test cases, </w:t>
-      </w:r>
-      <w:r>
-        <w:rPr>
-          <w:rFonts w:ascii="Cambria" w:hAnsi="Cambria" w:cs="Calibri"/>
-          <w:sz w:val="20"/>
-          <w:szCs w:val="20"/>
-        </w:rPr>
-        <w:t>finding</w:t>
-      </w:r>
-      <w:r>
-        <w:rPr>
-          <w:rFonts w:ascii="Cambria" w:hAnsi="Cambria" w:cs="Calibri"/>
-          <w:sz w:val="20"/>
-          <w:szCs w:val="20"/>
-        </w:rPr>
-        <w:t xml:space="preserve"> and reporting 10+ critical bugs, leading to improved system stability.</w:t>
-      </w:r>
-    </w:p>
-    <w:p>
-      <w:pPr>
-        <w:pStyle w:val="ListParagraph"/>
-        <w:numPr>
-          <w:ilvl w:val="0"/>
-          <w:numId w:val="3"/>
-        </w:numPr>
-        <w:tabs>
-          <w:tab w:val="left" w:pos="8789"/>
-        </w:tabs>
-        <w:ind w:left="426"/>
-        <w:contextualSpacing w:val="0"/>
-        <w:rPr>
-          <w:rFonts w:ascii="Cambria" w:hAnsi="Cambria" w:cs="Calibri"/>
-          <w:sz w:val="20"/>
-          <w:szCs w:val="20"/>
-        </w:rPr>
-      </w:pPr>
-      <w:bookmarkStart w:id="0" w:name="_Hlk189905130"/>
-      <w:r>
-        <w:rPr>
-          <w:rFonts w:ascii="Cambria" w:hAnsi="Cambria" w:cs="Calibri"/>
-          <w:sz w:val="20"/>
-          <w:szCs w:val="20"/>
-        </w:rPr>
-        <w:t>Facilitated cross-team communication between testers and developers, ensuring quick resolution of urgent issues.</w:t>
+        </w:rPr>
+      </w:pPr>
+      <w:r>
+        <w:rPr>
+          <w:rFonts w:ascii="Cambria" w:hAnsi="Cambria" w:cs="Calibri"/>
+        </w:rPr>
+        <w:t>I</w:t>
+      </w:r>
+      <w:r>
+        <w:rPr>
+          <w:rFonts w:ascii="Cambria" w:hAnsi="Cambria" w:cs="Calibri"/>
+        </w:rPr>
+        <w:t>dentified</w:t>
+      </w:r>
+      <w:r>
+        <w:rPr>
+          <w:rFonts w:ascii="Cambria" w:hAnsi="Cambria" w:cs="Calibri"/>
+        </w:rPr>
+        <w:t xml:space="preserve"> and documented 10+ critical defects, contributing to stability improvements prior to launch</w:t>
+      </w:r>
+      <w:r>
+        <w:rPr>
+          <w:rFonts w:ascii="Cambria" w:hAnsi="Cambria" w:cs="Calibri"/>
+        </w:rPr>
+        <w:t>.</w:t>
       </w:r>
     </w:p>
     <w:p>
@@ -760,17 +718,177 @@
         <w:contextualSpacing w:val="0"/>
         <w:rPr>
           <w:rFonts w:ascii="Cambria" w:hAnsi="Cambria" w:cs="Calibri"/>
-          <w:sz w:val="20"/>
-          <w:szCs w:val="20"/>
-        </w:rPr>
-      </w:pPr>
-      <w:r>
-        <w:rPr>
-          <w:rFonts w:ascii="Cambria" w:hAnsi="Cambria" w:cs="Calibri"/>
-          <w:sz w:val="20"/>
-          <w:szCs w:val="20"/>
-        </w:rPr>
-        <w:t>Contributed to 25% of the team’s test suite, meeting agile iteration deadlines and ensuring feature completeness.</w:t>
+        </w:rPr>
+      </w:pPr>
+      <w:r>
+        <w:rPr>
+          <w:rFonts w:ascii="Cambria" w:hAnsi="Cambria" w:cs="Calibri"/>
+        </w:rPr>
+        <w:t>Collaborated with developers to verify fixes and ensure regression-free deployments</w:t>
+      </w:r>
+      <w:r>
+        <w:rPr>
+          <w:rFonts w:ascii="Cambria" w:hAnsi="Cambria" w:cs="Calibri"/>
+        </w:rPr>
+        <w:t>.</w:t>
+      </w:r>
+    </w:p>
+    <w:p>
+      <w:pPr>
+        <w:tabs>
+          <w:tab w:val="right" w:pos="10773"/>
+        </w:tabs>
+        <w:rPr>
+          <w:rFonts w:ascii="Cambria" w:hAnsi="Cambria" w:cs="Calibri"/>
+        </w:rPr>
+      </w:pPr>
+      <w:r>
+        <w:rPr>
+          <w:rFonts w:ascii="Cambria" w:hAnsi="Cambria" w:cs="Calibri"/>
+          <w:b/>
+          <w:bCs/>
+        </w:rPr>
+        <w:t>FINTRAC | Application Developer</w:t>
+      </w:r>
+      <w:r>
+        <w:rPr>
+          <w:rFonts w:ascii="Cambria" w:hAnsi="Cambria" w:cs="Calibri"/>
+          <w:b/>
+          <w:bCs/>
+        </w:rPr>
+        <w:t xml:space="preserve"> | Ottawa, ON</w:t>
+      </w:r>
+      <w:r>
+        <w:rPr>
+          <w:rFonts w:ascii="Cambria" w:hAnsi="Cambria" w:cs="Calibri"/>
+        </w:rPr>
+        <w:tab/>
+      </w:r>
+      <w:r>
+        <w:rPr>
+          <w:rFonts w:ascii="Cambria" w:hAnsi="Cambria" w:cs="Calibri"/>
+          <w:i/>
+          <w:iCs/>
+        </w:rPr>
+        <w:t>Jan</w:t>
+      </w:r>
+      <w:r>
+        <w:rPr>
+          <w:rFonts w:ascii="Cambria" w:hAnsi="Cambria" w:cs="Calibri"/>
+          <w:i/>
+          <w:iCs/>
+        </w:rPr>
+        <w:t xml:space="preserve"> 2024 – </w:t>
+      </w:r>
+      <w:r>
+        <w:rPr>
+          <w:rFonts w:ascii="Cambria" w:hAnsi="Cambria" w:cs="Calibri"/>
+          <w:i/>
+          <w:iCs/>
+        </w:rPr>
+        <w:t>Apr</w:t>
+      </w:r>
+      <w:r>
+        <w:rPr>
+          <w:rFonts w:ascii="Cambria" w:hAnsi="Cambria" w:cs="Calibri"/>
+          <w:i/>
+          <w:iCs/>
+        </w:rPr>
+        <w:t xml:space="preserve"> 2024</w:t>
+      </w:r>
+    </w:p>
+    <w:p>
+      <w:pPr>
+        <w:pStyle w:val="ListParagraph"/>
+        <w:numPr>
+          <w:ilvl w:val="0"/>
+          <w:numId w:val="3"/>
+        </w:numPr>
+        <w:tabs>
+          <w:tab w:val="left" w:pos="8789"/>
+        </w:tabs>
+        <w:ind w:left="426"/>
+        <w:contextualSpacing w:val="0"/>
+        <w:rPr>
+          <w:rFonts w:ascii="Cambria" w:hAnsi="Cambria" w:cs="Calibri"/>
+        </w:rPr>
+      </w:pPr>
+      <w:r>
+        <w:rPr>
+          <w:rFonts w:ascii="Cambria" w:hAnsi="Cambria" w:cs="Calibri"/>
+        </w:rPr>
+        <w:t>Developed a Java-based automation tool to consume API endpoints and parse YAML documentation, reducing manual update time by 8+ hours per release.</w:t>
+      </w:r>
+    </w:p>
+    <w:p>
+      <w:pPr>
+        <w:pStyle w:val="ListParagraph"/>
+        <w:numPr>
+          <w:ilvl w:val="0"/>
+          <w:numId w:val="3"/>
+        </w:numPr>
+        <w:tabs>
+          <w:tab w:val="left" w:pos="8789"/>
+        </w:tabs>
+        <w:ind w:left="426"/>
+        <w:contextualSpacing w:val="0"/>
+        <w:rPr>
+          <w:rFonts w:ascii="Cambria" w:hAnsi="Cambria" w:cs="Calibri"/>
+        </w:rPr>
+      </w:pPr>
+      <w:bookmarkStart w:id="0" w:name="_Hlk189905130"/>
+      <w:r>
+        <w:rPr>
+          <w:rFonts w:ascii="Cambria" w:hAnsi="Cambria" w:cs="Calibri"/>
+        </w:rPr>
+        <w:t>Built a data validation utility to detect and update outdated API documentation automatically.</w:t>
+      </w:r>
+    </w:p>
+    <w:p>
+      <w:pPr>
+        <w:pStyle w:val="ListParagraph"/>
+        <w:numPr>
+          <w:ilvl w:val="0"/>
+          <w:numId w:val="3"/>
+        </w:numPr>
+        <w:tabs>
+          <w:tab w:val="left" w:pos="8789"/>
+        </w:tabs>
+        <w:ind w:left="426"/>
+        <w:contextualSpacing w:val="0"/>
+        <w:rPr>
+          <w:rFonts w:ascii="Cambria" w:hAnsi="Cambria" w:cs="Calibri"/>
+        </w:rPr>
+      </w:pPr>
+      <w:r>
+        <w:rPr>
+          <w:rFonts w:ascii="Cambria" w:hAnsi="Cambria" w:cs="Calibri"/>
+        </w:rPr>
+        <w:t>Resolved 50+ tracked issues in Azure DevOps, improving system stability and reducing recurring errors.</w:t>
+      </w:r>
+    </w:p>
+    <w:p>
+      <w:pPr>
+        <w:pStyle w:val="ListParagraph"/>
+        <w:numPr>
+          <w:ilvl w:val="0"/>
+          <w:numId w:val="3"/>
+        </w:numPr>
+        <w:tabs>
+          <w:tab w:val="left" w:pos="8789"/>
+        </w:tabs>
+        <w:spacing w:after="120"/>
+        <w:ind w:left="426"/>
+        <w:contextualSpacing w:val="0"/>
+        <w:rPr>
+          <w:rFonts w:ascii="Cambria" w:hAnsi="Cambria" w:cs="Calibri"/>
+        </w:rPr>
+      </w:pPr>
+      <w:r>
+        <w:rPr>
+          <w:rFonts w:ascii="Cambria" w:hAnsi="Cambria" w:cs="Calibri"/>
+        </w:rPr>
+        <w:t>Authored JUnit 5 tests to increase code coverage by 20% and improve validation reliability.</w:t>
       </w:r>
     </w:p>
     <w:bookmarkEnd w:id="0"/>
@@ -784,15 +902,19 @@
           <w:rFonts w:ascii="Cambria" w:hAnsi="Cambria" w:cs="Calibri"/>
           <w:b/>
           <w:bCs/>
-        </w:rPr>
-      </w:pPr>
-      <w:r>
-        <w:rPr>
-          <w:rFonts w:ascii="Cambria" w:hAnsi="Cambria" w:cs="Calibri"/>
-          <w:b/>
-          <w:bCs/>
-        </w:rPr>
-        <w:t>Projects</w:t>
+          <w:sz w:val="24"/>
+          <w:szCs w:val="24"/>
+        </w:rPr>
+      </w:pPr>
+      <w:r>
+        <w:rPr>
+          <w:rFonts w:ascii="Cambria" w:hAnsi="Cambria" w:cs="Calibri"/>
+          <w:b/>
+          <w:bCs/>
+          <w:sz w:val="24"/>
+          <w:szCs w:val="24"/>
+        </w:rPr>
+        <w:t>Education</w:t>
       </w:r>
     </w:p>
     <w:p>
@@ -802,40 +924,8 @@
         </w:tabs>
         <w:rPr>
           <w:rFonts w:ascii="Cambria" w:hAnsi="Cambria" w:cs="Calibri"/>
-          <w:sz w:val="20"/>
-          <w:szCs w:val="20"/>
-        </w:rPr>
-      </w:pPr>
-      <w:r>
-        <w:rPr>
-          <w:rFonts w:ascii="Cambria" w:hAnsi="Cambria" w:cs="Calibri"/>
-          <w:b/>
-          <w:bCs/>
-          <w:sz w:val="20"/>
-          <w:szCs w:val="20"/>
-        </w:rPr>
-        <w:t>Meeting</w:t>
-      </w:r>
-      <w:r>
-        <w:rPr>
-          <w:rFonts w:ascii="Cambria" w:hAnsi="Cambria" w:cs="Calibri"/>
-          <w:b/>
-          <w:bCs/>
-          <w:sz w:val="20"/>
-          <w:szCs w:val="20"/>
-        </w:rPr>
-        <w:t xml:space="preserve"> </w:t>
-      </w:r>
-      <w:r>
-        <w:rPr>
-          <w:rFonts w:ascii="Cambria" w:hAnsi="Cambria" w:cs="Calibri"/>
-          <w:b/>
-          <w:bCs/>
-          <w:sz w:val="20"/>
-          <w:szCs w:val="20"/>
-        </w:rPr>
-        <w:t xml:space="preserve">Map | </w:t>
-      </w:r>
+        </w:rPr>
+      </w:pPr>
       <w:hyperlink r:id="rId11" w:history="1">
         <w:r>
           <w:rPr>
@@ -843,980 +933,6 @@
             <w:rFonts w:ascii="Cambria" w:hAnsi="Cambria" w:cs="Calibri"/>
             <w:b/>
             <w:bCs/>
-            <w:sz w:val="20"/>
-            <w:szCs w:val="20"/>
-          </w:rPr>
-          <w:t>GitHub</w:t>
-        </w:r>
-      </w:hyperlink>
-      <w:r>
-        <w:rPr>
-          <w:rFonts w:ascii="Cambria" w:hAnsi="Cambria" w:cs="Calibri"/>
-          <w:b/>
-          <w:bCs/>
-          <w:sz w:val="20"/>
-          <w:szCs w:val="20"/>
-        </w:rPr>
-        <w:t xml:space="preserve"> | </w:t>
-      </w:r>
-      <w:hyperlink r:id="rId12" w:history="1">
-        <w:r>
-          <w:rPr>
-            <w:rStyle w:val="Hyperlink"/>
-            <w:rFonts w:ascii="Cambria" w:hAnsi="Cambria" w:cs="Calibri"/>
-            <w:b/>
-            <w:bCs/>
-            <w:sz w:val="20"/>
-            <w:szCs w:val="20"/>
-          </w:rPr>
-          <w:t>Demo</w:t>
-        </w:r>
-      </w:hyperlink>
-      <w:r>
-        <w:rPr>
-          <w:rFonts w:ascii="Cambria" w:hAnsi="Cambria" w:cs="Calibri"/>
-          <w:sz w:val="20"/>
-          <w:szCs w:val="20"/>
-        </w:rPr>
-        <w:tab/>
-      </w:r>
-      <w:r>
-        <w:rPr>
-          <w:rFonts w:ascii="Cambria" w:hAnsi="Cambria" w:cs="Calibri"/>
-          <w:i/>
-          <w:iCs/>
-          <w:sz w:val="20"/>
-          <w:szCs w:val="20"/>
-        </w:rPr>
-        <w:t>Node.js, Express, MongoDB, React, Tailwind CSS</w:t>
-      </w:r>
-    </w:p>
-    <w:p>
-      <w:pPr>
-        <w:pStyle w:val="ListParagraph"/>
-        <w:numPr>
-          <w:ilvl w:val="0"/>
-          <w:numId w:val="4"/>
-        </w:numPr>
-        <w:tabs>
-          <w:tab w:val="right" w:pos="10773"/>
-        </w:tabs>
-        <w:ind w:left="426"/>
-        <w:contextualSpacing w:val="0"/>
-        <w:rPr>
-          <w:rFonts w:ascii="Cambria" w:hAnsi="Cambria" w:cs="Calibri"/>
-          <w:sz w:val="20"/>
-          <w:szCs w:val="20"/>
-        </w:rPr>
-      </w:pPr>
-      <w:r>
-        <w:rPr>
-          <w:rFonts w:ascii="Cambria" w:hAnsi="Cambria" w:cs="Calibri"/>
-          <w:sz w:val="20"/>
-          <w:szCs w:val="20"/>
-        </w:rPr>
-        <w:t>Developed a meeting scheduling platform with role-based authentication, enabling admins to manage users and rooms.</w:t>
-      </w:r>
-    </w:p>
-    <w:p>
-      <w:pPr>
-        <w:pStyle w:val="ListParagraph"/>
-        <w:numPr>
-          <w:ilvl w:val="0"/>
-          <w:numId w:val="4"/>
-        </w:numPr>
-        <w:tabs>
-          <w:tab w:val="right" w:pos="10773"/>
-        </w:tabs>
-        <w:ind w:left="426"/>
-        <w:contextualSpacing w:val="0"/>
-        <w:rPr>
-          <w:rFonts w:ascii="Cambria" w:hAnsi="Cambria" w:cs="Calibri"/>
-          <w:sz w:val="20"/>
-          <w:szCs w:val="20"/>
-        </w:rPr>
-      </w:pPr>
-      <w:r>
-        <w:rPr>
-          <w:rFonts w:ascii="Cambria" w:hAnsi="Cambria" w:cs="Calibri"/>
-          <w:sz w:val="20"/>
-          <w:szCs w:val="20"/>
-        </w:rPr>
-        <w:t xml:space="preserve">Integrated React Query for real-time data synchronization, </w:t>
-      </w:r>
-      <w:r>
-        <w:rPr>
-          <w:rFonts w:ascii="Cambria" w:hAnsi="Cambria" w:cs="Calibri"/>
-          <w:sz w:val="20"/>
-          <w:szCs w:val="20"/>
-        </w:rPr>
-        <w:t>refining</w:t>
-      </w:r>
-      <w:r>
-        <w:rPr>
-          <w:rFonts w:ascii="Cambria" w:hAnsi="Cambria" w:cs="Calibri"/>
-          <w:sz w:val="20"/>
-          <w:szCs w:val="20"/>
-        </w:rPr>
-        <w:t xml:space="preserve"> API calls and state management.</w:t>
-      </w:r>
-    </w:p>
-    <w:p>
-      <w:pPr>
-        <w:pStyle w:val="ListParagraph"/>
-        <w:numPr>
-          <w:ilvl w:val="0"/>
-          <w:numId w:val="4"/>
-        </w:numPr>
-        <w:tabs>
-          <w:tab w:val="right" w:pos="10773"/>
-        </w:tabs>
-        <w:spacing w:after="120"/>
-        <w:ind w:left="426"/>
-        <w:contextualSpacing w:val="0"/>
-        <w:rPr>
-          <w:rFonts w:ascii="Cambria" w:hAnsi="Cambria" w:cs="Calibri"/>
-          <w:sz w:val="20"/>
-          <w:szCs w:val="20"/>
-        </w:rPr>
-      </w:pPr>
-      <w:r>
-        <w:rPr>
-          <w:rFonts w:ascii="Cambria" w:hAnsi="Cambria" w:cs="Calibri"/>
-          <w:sz w:val="20"/>
-          <w:szCs w:val="20"/>
-        </w:rPr>
-        <w:t xml:space="preserve">Automated expired meeting cleanup using node-cron, ensuring database efficiency </w:t>
-      </w:r>
-      <w:r>
-        <w:rPr>
-          <w:rFonts w:ascii="Cambria" w:hAnsi="Cambria" w:cs="Calibri"/>
-          <w:sz w:val="20"/>
-          <w:szCs w:val="20"/>
-        </w:rPr>
-        <w:t>and</w:t>
-      </w:r>
-      <w:r>
-        <w:rPr>
-          <w:rFonts w:ascii="Cambria" w:hAnsi="Cambria" w:cs="Calibri"/>
-          <w:sz w:val="20"/>
-          <w:szCs w:val="20"/>
-        </w:rPr>
-        <w:t xml:space="preserve"> </w:t>
-      </w:r>
-      <w:r>
-        <w:rPr>
-          <w:rFonts w:ascii="Cambria" w:hAnsi="Cambria" w:cs="Calibri"/>
-          <w:sz w:val="20"/>
-          <w:szCs w:val="20"/>
-        </w:rPr>
-        <w:t xml:space="preserve">a cleaner </w:t>
-      </w:r>
-      <w:r>
-        <w:rPr>
-          <w:rFonts w:ascii="Cambria" w:hAnsi="Cambria" w:cs="Calibri"/>
-          <w:sz w:val="20"/>
-          <w:szCs w:val="20"/>
-        </w:rPr>
-        <w:t xml:space="preserve">user </w:t>
-      </w:r>
-      <w:r>
-        <w:rPr>
-          <w:rFonts w:ascii="Cambria" w:hAnsi="Cambria" w:cs="Calibri"/>
-          <w:sz w:val="20"/>
-          <w:szCs w:val="20"/>
-        </w:rPr>
-        <w:t>experience</w:t>
-      </w:r>
-      <w:r>
-        <w:rPr>
-          <w:rFonts w:ascii="Cambria" w:hAnsi="Cambria" w:cs="Calibri"/>
-          <w:sz w:val="20"/>
-          <w:szCs w:val="20"/>
-        </w:rPr>
-        <w:t>.</w:t>
-      </w:r>
-    </w:p>
-    <w:p>
-      <w:pPr>
-        <w:tabs>
-          <w:tab w:val="right" w:pos="10773"/>
-        </w:tabs>
-        <w:rPr>
-          <w:rFonts w:ascii="Cambria" w:hAnsi="Cambria" w:cs="Calibri"/>
-          <w:sz w:val="20"/>
-          <w:szCs w:val="20"/>
-        </w:rPr>
-      </w:pPr>
-      <w:r>
-        <w:rPr>
-          <w:rFonts w:ascii="Cambria" w:hAnsi="Cambria" w:cs="Calibri"/>
-          <w:b/>
-          <w:bCs/>
-          <w:sz w:val="20"/>
-          <w:szCs w:val="20"/>
-        </w:rPr>
-        <w:t>LinkLounge</w:t>
-      </w:r>
-      <w:r>
-        <w:rPr>
-          <w:rFonts w:ascii="Cambria" w:hAnsi="Cambria" w:cs="Calibri"/>
-          <w:b/>
-          <w:bCs/>
-          <w:sz w:val="20"/>
-          <w:szCs w:val="20"/>
-        </w:rPr>
-        <w:t xml:space="preserve"> | </w:t>
-      </w:r>
-      <w:hyperlink r:id="rId13" w:history="1">
-        <w:r>
-          <w:rPr>
-            <w:rStyle w:val="Hyperlink"/>
-            <w:rFonts w:ascii="Cambria" w:hAnsi="Cambria" w:cs="Calibri"/>
-            <w:b/>
-            <w:bCs/>
-            <w:sz w:val="20"/>
-            <w:szCs w:val="20"/>
-          </w:rPr>
-          <w:t>GitHub</w:t>
-        </w:r>
-      </w:hyperlink>
-      <w:r>
-        <w:rPr>
-          <w:rFonts w:ascii="Cambria" w:hAnsi="Cambria" w:cs="Calibri"/>
-          <w:b/>
-          <w:bCs/>
-          <w:sz w:val="20"/>
-          <w:szCs w:val="20"/>
-        </w:rPr>
-        <w:t xml:space="preserve"> | </w:t>
-      </w:r>
-      <w:hyperlink r:id="rId14" w:history="1">
-        <w:r>
-          <w:rPr>
-            <w:rStyle w:val="Hyperlink"/>
-            <w:rFonts w:ascii="Cambria" w:hAnsi="Cambria" w:cs="Calibri"/>
-            <w:b/>
-            <w:bCs/>
-            <w:sz w:val="20"/>
-            <w:szCs w:val="20"/>
-          </w:rPr>
-          <w:t>Demo</w:t>
-        </w:r>
-      </w:hyperlink>
-      <w:r>
-        <w:rPr>
-          <w:rFonts w:ascii="Cambria" w:hAnsi="Cambria" w:cs="Calibri"/>
-          <w:sz w:val="20"/>
-          <w:szCs w:val="20"/>
-        </w:rPr>
-        <w:tab/>
-      </w:r>
-      <w:r>
-        <w:rPr>
-          <w:rFonts w:ascii="Cambria" w:hAnsi="Cambria" w:cs="Calibri"/>
-          <w:i/>
-          <w:iCs/>
-          <w:sz w:val="20"/>
-          <w:szCs w:val="20"/>
-        </w:rPr>
-        <w:t>Node.js, Express, MongoDB, React, Tailwind CSS</w:t>
-      </w:r>
-    </w:p>
-    <w:p>
-      <w:pPr>
-        <w:pStyle w:val="ListParagraph"/>
-        <w:numPr>
-          <w:ilvl w:val="0"/>
-          <w:numId w:val="5"/>
-        </w:numPr>
-        <w:tabs>
-          <w:tab w:val="right" w:pos="10773"/>
-        </w:tabs>
-        <w:ind w:left="426"/>
-        <w:contextualSpacing w:val="0"/>
-        <w:rPr>
-          <w:rFonts w:ascii="Cambria" w:hAnsi="Cambria" w:cs="Calibri"/>
-          <w:sz w:val="20"/>
-          <w:szCs w:val="20"/>
-        </w:rPr>
-      </w:pPr>
-      <w:r>
-        <w:rPr>
-          <w:rFonts w:ascii="Cambria" w:hAnsi="Cambria" w:cs="Calibri"/>
-          <w:sz w:val="20"/>
-          <w:szCs w:val="20"/>
-        </w:rPr>
-        <w:t xml:space="preserve">Designed a custom </w:t>
-      </w:r>
-      <w:r>
-        <w:rPr>
-          <w:rFonts w:ascii="Cambria" w:hAnsi="Cambria" w:cs="Calibri"/>
-          <w:sz w:val="20"/>
-          <w:szCs w:val="20"/>
-        </w:rPr>
-        <w:t>web</w:t>
-      </w:r>
-      <w:r>
-        <w:rPr>
-          <w:rFonts w:ascii="Cambria" w:hAnsi="Cambria" w:cs="Calibri"/>
-          <w:sz w:val="20"/>
-          <w:szCs w:val="20"/>
-        </w:rPr>
-        <w:t xml:space="preserve"> page builder, allowing users to create profiles with unique themes, icons, and unlimited links.</w:t>
-      </w:r>
-    </w:p>
-    <w:p>
-      <w:pPr>
-        <w:pStyle w:val="ListParagraph"/>
-        <w:numPr>
-          <w:ilvl w:val="0"/>
-          <w:numId w:val="5"/>
-        </w:numPr>
-        <w:tabs>
-          <w:tab w:val="right" w:pos="10773"/>
-        </w:tabs>
-        <w:ind w:left="426"/>
-        <w:contextualSpacing w:val="0"/>
-        <w:rPr>
-          <w:rFonts w:ascii="Cambria" w:hAnsi="Cambria" w:cs="Calibri"/>
-          <w:sz w:val="20"/>
-          <w:szCs w:val="20"/>
-        </w:rPr>
-      </w:pPr>
-      <w:r>
-        <w:rPr>
-          <w:rFonts w:ascii="Cambria" w:hAnsi="Cambria" w:cs="Calibri"/>
-          <w:sz w:val="20"/>
-          <w:szCs w:val="20"/>
-        </w:rPr>
-        <w:t xml:space="preserve">Implemented JWT authentication with email-based password </w:t>
-      </w:r>
-      <w:r>
-        <w:rPr>
-          <w:rFonts w:ascii="Cambria" w:hAnsi="Cambria" w:cs="Calibri"/>
-          <w:sz w:val="20"/>
-          <w:szCs w:val="20"/>
-        </w:rPr>
-        <w:t>reset</w:t>
-      </w:r>
-      <w:r>
-        <w:rPr>
-          <w:rFonts w:ascii="Cambria" w:hAnsi="Cambria" w:cs="Calibri"/>
-          <w:sz w:val="20"/>
-          <w:szCs w:val="20"/>
-        </w:rPr>
-        <w:t>ting</w:t>
-      </w:r>
-      <w:r>
-        <w:rPr>
-          <w:rFonts w:ascii="Cambria" w:hAnsi="Cambria" w:cs="Calibri"/>
-          <w:sz w:val="20"/>
-          <w:szCs w:val="20"/>
-        </w:rPr>
-        <w:t>, securing user</w:t>
-      </w:r>
-      <w:r>
-        <w:rPr>
-          <w:rFonts w:ascii="Cambria" w:hAnsi="Cambria" w:cs="Calibri"/>
-          <w:sz w:val="20"/>
-          <w:szCs w:val="20"/>
-        </w:rPr>
-        <w:t xml:space="preserve">s </w:t>
-      </w:r>
-      <w:r>
-        <w:rPr>
-          <w:rFonts w:ascii="Cambria" w:hAnsi="Cambria" w:cs="Calibri"/>
-          <w:sz w:val="20"/>
-          <w:szCs w:val="20"/>
-        </w:rPr>
-        <w:t>and improving recovery options.</w:t>
-      </w:r>
-    </w:p>
-    <w:p>
-      <w:pPr>
-        <w:pStyle w:val="ListParagraph"/>
-        <w:numPr>
-          <w:ilvl w:val="0"/>
-          <w:numId w:val="5"/>
-        </w:numPr>
-        <w:tabs>
-          <w:tab w:val="right" w:pos="10773"/>
-        </w:tabs>
-        <w:spacing w:after="120"/>
-        <w:ind w:left="426"/>
-        <w:contextualSpacing w:val="0"/>
-        <w:rPr>
-          <w:rFonts w:ascii="Cambria" w:hAnsi="Cambria" w:cs="Calibri"/>
-          <w:sz w:val="20"/>
-          <w:szCs w:val="20"/>
-        </w:rPr>
-      </w:pPr>
-      <w:r>
-        <w:rPr>
-          <w:rFonts w:ascii="Cambria" w:hAnsi="Cambria" w:cs="Calibri"/>
-          <w:sz w:val="20"/>
-          <w:szCs w:val="20"/>
-        </w:rPr>
-        <w:t>Developed an email feedback system using Nodemailer, enabling direct communication between users and admins.</w:t>
-      </w:r>
-    </w:p>
-    <w:p>
-      <w:pPr>
-        <w:tabs>
-          <w:tab w:val="right" w:pos="10773"/>
-        </w:tabs>
-        <w:rPr>
-          <w:rFonts w:ascii="Cambria" w:hAnsi="Cambria" w:cs="Calibri"/>
-          <w:sz w:val="20"/>
-          <w:szCs w:val="20"/>
-        </w:rPr>
-      </w:pPr>
-      <w:r>
-        <w:rPr>
-          <w:rFonts w:ascii="Cambria" w:hAnsi="Cambria" w:cs="Calibri"/>
-          <w:b/>
-          <w:bCs/>
-          <w:sz w:val="20"/>
-          <w:szCs w:val="20"/>
-        </w:rPr>
-        <w:t xml:space="preserve">Video Game Database | </w:t>
-      </w:r>
-      <w:hyperlink r:id="rId15" w:history="1">
-        <w:r>
-          <w:rPr>
-            <w:rStyle w:val="Hyperlink"/>
-            <w:rFonts w:ascii="Cambria" w:hAnsi="Cambria" w:cs="Calibri"/>
-            <w:b/>
-            <w:bCs/>
-            <w:sz w:val="20"/>
-            <w:szCs w:val="20"/>
-          </w:rPr>
-          <w:t>GitHub</w:t>
-        </w:r>
-      </w:hyperlink>
-      <w:r>
-        <w:rPr>
-          <w:rFonts w:ascii="Cambria" w:hAnsi="Cambria" w:cs="Calibri"/>
-          <w:sz w:val="20"/>
-          <w:szCs w:val="20"/>
-        </w:rPr>
-        <w:tab/>
-      </w:r>
-      <w:r>
-        <w:rPr>
-          <w:rFonts w:ascii="Cambria" w:hAnsi="Cambria" w:cs="Calibri"/>
-          <w:i/>
-          <w:iCs/>
-          <w:sz w:val="20"/>
-          <w:szCs w:val="20"/>
-        </w:rPr>
-        <w:t>Java, Spring Boot, MongoDB, React, Tailwind CSS, Maven</w:t>
-      </w:r>
-    </w:p>
-    <w:p>
-      <w:pPr>
-        <w:pStyle w:val="ListParagraph"/>
-        <w:numPr>
-          <w:ilvl w:val="0"/>
-          <w:numId w:val="6"/>
-        </w:numPr>
-        <w:tabs>
-          <w:tab w:val="right" w:pos="10773"/>
-        </w:tabs>
-        <w:ind w:left="426"/>
-        <w:contextualSpacing w:val="0"/>
-        <w:rPr>
-          <w:rFonts w:ascii="Cambria" w:hAnsi="Cambria" w:cs="Calibri"/>
-          <w:sz w:val="20"/>
-          <w:szCs w:val="20"/>
-        </w:rPr>
-      </w:pPr>
-      <w:r>
-        <w:rPr>
-          <w:rFonts w:ascii="Cambria" w:hAnsi="Cambria" w:cs="Calibri"/>
-          <w:sz w:val="20"/>
-          <w:szCs w:val="20"/>
-        </w:rPr>
-        <w:t>Built a RESTful API in Spring Boot with Maven dependenc</w:t>
-      </w:r>
-      <w:r>
-        <w:rPr>
-          <w:rFonts w:ascii="Cambria" w:hAnsi="Cambria" w:cs="Calibri"/>
-          <w:sz w:val="20"/>
-          <w:szCs w:val="20"/>
-        </w:rPr>
-        <w:t>ies</w:t>
-      </w:r>
-      <w:r>
-        <w:rPr>
-          <w:rFonts w:ascii="Cambria" w:hAnsi="Cambria" w:cs="Calibri"/>
-          <w:sz w:val="20"/>
-          <w:szCs w:val="20"/>
-        </w:rPr>
-        <w:t>, ensuring modular and maintainable development.</w:t>
-      </w:r>
-    </w:p>
-    <w:p>
-      <w:pPr>
-        <w:pStyle w:val="ListParagraph"/>
-        <w:numPr>
-          <w:ilvl w:val="0"/>
-          <w:numId w:val="6"/>
-        </w:numPr>
-        <w:tabs>
-          <w:tab w:val="right" w:pos="10773"/>
-        </w:tabs>
-        <w:ind w:left="426"/>
-        <w:contextualSpacing w:val="0"/>
-        <w:rPr>
-          <w:rFonts w:ascii="Cambria" w:hAnsi="Cambria" w:cs="Calibri"/>
-          <w:sz w:val="20"/>
-          <w:szCs w:val="20"/>
-        </w:rPr>
-      </w:pPr>
-      <w:r>
-        <w:rPr>
-          <w:rFonts w:ascii="Cambria" w:hAnsi="Cambria" w:cs="Calibri"/>
-          <w:sz w:val="20"/>
-          <w:szCs w:val="20"/>
-        </w:rPr>
-        <w:t>Created a React front-end with an intuitive UI, allowing users to browse, filter, and review video games.</w:t>
-      </w:r>
-    </w:p>
-    <w:p>
-      <w:pPr>
-        <w:pStyle w:val="ListParagraph"/>
-        <w:numPr>
-          <w:ilvl w:val="0"/>
-          <w:numId w:val="6"/>
-        </w:numPr>
-        <w:tabs>
-          <w:tab w:val="right" w:pos="10773"/>
-        </w:tabs>
-        <w:spacing w:after="120"/>
-        <w:ind w:left="426"/>
-        <w:contextualSpacing w:val="0"/>
-        <w:rPr>
-          <w:rFonts w:ascii="Cambria" w:hAnsi="Cambria" w:cs="Calibri"/>
-          <w:sz w:val="20"/>
-          <w:szCs w:val="20"/>
-        </w:rPr>
-      </w:pPr>
-      <w:r>
-        <w:rPr>
-          <w:rFonts w:ascii="Cambria" w:hAnsi="Cambria" w:cs="Calibri"/>
-          <w:sz w:val="20"/>
-          <w:szCs w:val="20"/>
-        </w:rPr>
-        <w:t xml:space="preserve">Designed a MongoDB database schema to store user reviews and dynamically update game </w:t>
-      </w:r>
-      <w:r>
-        <w:rPr>
-          <w:rFonts w:ascii="Cambria" w:hAnsi="Cambria" w:cs="Calibri"/>
-          <w:sz w:val="20"/>
-          <w:szCs w:val="20"/>
-        </w:rPr>
-        <w:t>information</w:t>
-      </w:r>
-      <w:r>
-        <w:rPr>
-          <w:rFonts w:ascii="Cambria" w:hAnsi="Cambria" w:cs="Calibri"/>
-          <w:sz w:val="20"/>
-          <w:szCs w:val="20"/>
-        </w:rPr>
-        <w:t>.</w:t>
-      </w:r>
-    </w:p>
-    <w:p>
-      <w:pPr>
-        <w:tabs>
-          <w:tab w:val="right" w:pos="10773"/>
-        </w:tabs>
-        <w:rPr>
-          <w:rFonts w:ascii="Cambria" w:hAnsi="Cambria" w:cs="Calibri"/>
-          <w:sz w:val="20"/>
-          <w:szCs w:val="20"/>
-        </w:rPr>
-      </w:pPr>
-      <w:r>
-        <w:rPr>
-          <w:rFonts w:ascii="Cambria" w:hAnsi="Cambria" w:cs="Calibri"/>
-          <w:b/>
-          <w:bCs/>
-          <w:sz w:val="20"/>
-          <w:szCs w:val="20"/>
-        </w:rPr>
-        <w:t xml:space="preserve">Flashcards | </w:t>
-      </w:r>
-      <w:hyperlink r:id="rId16" w:history="1">
-        <w:r>
-          <w:rPr>
-            <w:rStyle w:val="Hyperlink"/>
-            <w:rFonts w:ascii="Cambria" w:hAnsi="Cambria" w:cs="Calibri"/>
-            <w:b/>
-            <w:bCs/>
-            <w:sz w:val="20"/>
-            <w:szCs w:val="20"/>
-          </w:rPr>
-          <w:t>GitHub</w:t>
-        </w:r>
-      </w:hyperlink>
-      <w:r>
-        <w:rPr>
-          <w:rFonts w:ascii="Cambria" w:hAnsi="Cambria" w:cs="Calibri"/>
-          <w:b/>
-          <w:bCs/>
-          <w:sz w:val="20"/>
-          <w:szCs w:val="20"/>
-        </w:rPr>
-        <w:t xml:space="preserve"> | </w:t>
-      </w:r>
-      <w:hyperlink r:id="rId17" w:history="1">
-        <w:r>
-          <w:rPr>
-            <w:rStyle w:val="Hyperlink"/>
-            <w:rFonts w:ascii="Cambria" w:hAnsi="Cambria" w:cs="Calibri"/>
-            <w:b/>
-            <w:bCs/>
-            <w:sz w:val="20"/>
-            <w:szCs w:val="20"/>
-          </w:rPr>
-          <w:t>Demo</w:t>
-        </w:r>
-      </w:hyperlink>
-      <w:r>
-        <w:rPr>
-          <w:rFonts w:ascii="Cambria" w:hAnsi="Cambria" w:cs="Calibri"/>
-          <w:sz w:val="20"/>
-          <w:szCs w:val="20"/>
-        </w:rPr>
-        <w:tab/>
-      </w:r>
-      <w:r>
-        <w:rPr>
-          <w:rFonts w:ascii="Cambria" w:hAnsi="Cambria" w:cs="Calibri"/>
-          <w:i/>
-          <w:iCs/>
-          <w:sz w:val="20"/>
-          <w:szCs w:val="20"/>
-        </w:rPr>
-        <w:t>React, Tailwind CSS</w:t>
-      </w:r>
-    </w:p>
-    <w:p>
-      <w:pPr>
-        <w:pStyle w:val="ListParagraph"/>
-        <w:numPr>
-          <w:ilvl w:val="0"/>
-          <w:numId w:val="7"/>
-        </w:numPr>
-        <w:tabs>
-          <w:tab w:val="right" w:pos="10773"/>
-        </w:tabs>
-        <w:ind w:left="426"/>
-        <w:contextualSpacing w:val="0"/>
-        <w:rPr>
-          <w:rFonts w:ascii="Cambria" w:hAnsi="Cambria" w:cs="Calibri"/>
-          <w:sz w:val="20"/>
-          <w:szCs w:val="20"/>
-        </w:rPr>
-      </w:pPr>
-      <w:r>
-        <w:rPr>
-          <w:rFonts w:ascii="Cambria" w:hAnsi="Cambria" w:cs="Calibri"/>
-          <w:sz w:val="20"/>
-          <w:szCs w:val="20"/>
-        </w:rPr>
-        <w:t xml:space="preserve">Developed </w:t>
-      </w:r>
-      <w:r>
-        <w:rPr>
-          <w:rFonts w:ascii="Cambria" w:hAnsi="Cambria" w:cs="Calibri"/>
-          <w:sz w:val="20"/>
-          <w:szCs w:val="20"/>
-        </w:rPr>
-        <w:t xml:space="preserve">a </w:t>
-      </w:r>
-      <w:r>
-        <w:rPr>
-          <w:rFonts w:ascii="Cambria" w:hAnsi="Cambria" w:cs="Calibri"/>
-          <w:sz w:val="20"/>
-          <w:szCs w:val="20"/>
-        </w:rPr>
-        <w:t>study tool using IndexedDB, enabling users to manage flashcards without a</w:t>
-      </w:r>
-      <w:r>
-        <w:rPr>
-          <w:rFonts w:ascii="Cambria" w:hAnsi="Cambria" w:cs="Calibri"/>
-          <w:sz w:val="20"/>
-          <w:szCs w:val="20"/>
-        </w:rPr>
-        <w:t xml:space="preserve"> database </w:t>
-      </w:r>
-      <w:r>
-        <w:rPr>
-          <w:rFonts w:ascii="Cambria" w:hAnsi="Cambria" w:cs="Calibri"/>
-          <w:sz w:val="20"/>
-          <w:szCs w:val="20"/>
-        </w:rPr>
-        <w:t>connection.</w:t>
-      </w:r>
-    </w:p>
-    <w:p>
-      <w:pPr>
-        <w:pStyle w:val="ListParagraph"/>
-        <w:numPr>
-          <w:ilvl w:val="0"/>
-          <w:numId w:val="7"/>
-        </w:numPr>
-        <w:tabs>
-          <w:tab w:val="right" w:pos="10773"/>
-        </w:tabs>
-        <w:ind w:left="426"/>
-        <w:contextualSpacing w:val="0"/>
-        <w:rPr>
-          <w:rFonts w:ascii="Cambria" w:hAnsi="Cambria" w:cs="Calibri"/>
-          <w:sz w:val="20"/>
-          <w:szCs w:val="20"/>
-        </w:rPr>
-      </w:pPr>
-      <w:r>
-        <w:rPr>
-          <w:rFonts w:ascii="Cambria" w:hAnsi="Cambria" w:cs="Calibri"/>
-          <w:sz w:val="20"/>
-          <w:szCs w:val="20"/>
-        </w:rPr>
-        <w:t>Implemented JSON export/import functionality, allowing users to back up and restore decks seamlessly.</w:t>
-      </w:r>
-    </w:p>
-    <w:p>
-      <w:pPr>
-        <w:pStyle w:val="ListParagraph"/>
-        <w:numPr>
-          <w:ilvl w:val="0"/>
-          <w:numId w:val="7"/>
-        </w:numPr>
-        <w:tabs>
-          <w:tab w:val="right" w:pos="10773"/>
-        </w:tabs>
-        <w:spacing w:after="120"/>
-        <w:ind w:left="426"/>
-        <w:contextualSpacing w:val="0"/>
-        <w:rPr>
-          <w:rFonts w:ascii="Cambria" w:hAnsi="Cambria" w:cs="Calibri"/>
-          <w:sz w:val="20"/>
-          <w:szCs w:val="20"/>
-        </w:rPr>
-      </w:pPr>
-      <w:r>
-        <w:rPr>
-          <w:rFonts w:ascii="Cambria" w:hAnsi="Cambria" w:cs="Calibri"/>
-          <w:sz w:val="20"/>
-          <w:szCs w:val="20"/>
-        </w:rPr>
-        <w:t>Designed a fully responsive UI, ensuring accessibility across desktop and mobile devices.</w:t>
-      </w:r>
-    </w:p>
-    <w:p>
-      <w:pPr>
-        <w:tabs>
-          <w:tab w:val="right" w:pos="10773"/>
-        </w:tabs>
-        <w:rPr>
-          <w:rFonts w:ascii="Cambria" w:hAnsi="Cambria" w:cs="Calibri"/>
-          <w:sz w:val="20"/>
-          <w:szCs w:val="20"/>
-        </w:rPr>
-      </w:pPr>
-      <w:r>
-        <w:rPr>
-          <w:rFonts w:ascii="Cambria" w:hAnsi="Cambria" w:cs="Calibri"/>
-          <w:b/>
-          <w:bCs/>
-          <w:sz w:val="20"/>
-          <w:szCs w:val="20"/>
-        </w:rPr>
-        <w:t xml:space="preserve">Wordle Clone | </w:t>
-      </w:r>
-      <w:hyperlink r:id="rId18" w:history="1">
-        <w:r>
-          <w:rPr>
-            <w:rStyle w:val="Hyperlink"/>
-            <w:rFonts w:ascii="Cambria" w:hAnsi="Cambria" w:cs="Calibri"/>
-            <w:b/>
-            <w:bCs/>
-            <w:sz w:val="20"/>
-            <w:szCs w:val="20"/>
-          </w:rPr>
-          <w:t>GitHub</w:t>
-        </w:r>
-      </w:hyperlink>
-      <w:r>
-        <w:rPr>
-          <w:rFonts w:ascii="Cambria" w:hAnsi="Cambria" w:cs="Calibri"/>
-          <w:b/>
-          <w:bCs/>
-          <w:sz w:val="20"/>
-          <w:szCs w:val="20"/>
-        </w:rPr>
-        <w:t xml:space="preserve"> | </w:t>
-      </w:r>
-      <w:hyperlink r:id="rId19" w:history="1">
-        <w:r>
-          <w:rPr>
-            <w:rStyle w:val="Hyperlink"/>
-            <w:rFonts w:ascii="Cambria" w:hAnsi="Cambria" w:cs="Calibri"/>
-            <w:b/>
-            <w:bCs/>
-            <w:sz w:val="20"/>
-            <w:szCs w:val="20"/>
-          </w:rPr>
-          <w:t>Demo</w:t>
-        </w:r>
-      </w:hyperlink>
-      <w:r>
-        <w:rPr>
-          <w:rFonts w:ascii="Cambria" w:hAnsi="Cambria" w:cs="Calibri"/>
-          <w:sz w:val="20"/>
-          <w:szCs w:val="20"/>
-        </w:rPr>
-        <w:tab/>
-      </w:r>
-      <w:r>
-        <w:rPr>
-          <w:rFonts w:ascii="Cambria" w:hAnsi="Cambria" w:cs="Calibri"/>
-          <w:i/>
-          <w:iCs/>
-          <w:sz w:val="20"/>
-          <w:szCs w:val="20"/>
-        </w:rPr>
-        <w:t>React, Tailwind CSS</w:t>
-      </w:r>
-    </w:p>
-    <w:p>
-      <w:pPr>
-        <w:pStyle w:val="ListParagraph"/>
-        <w:numPr>
-          <w:ilvl w:val="0"/>
-          <w:numId w:val="8"/>
-        </w:numPr>
-        <w:tabs>
-          <w:tab w:val="right" w:pos="10773"/>
-        </w:tabs>
-        <w:ind w:left="426"/>
-        <w:contextualSpacing w:val="0"/>
-        <w:rPr>
-          <w:rFonts w:ascii="Cambria" w:hAnsi="Cambria" w:cs="Calibri"/>
-          <w:sz w:val="20"/>
-          <w:szCs w:val="20"/>
-        </w:rPr>
-      </w:pPr>
-      <w:r>
-        <w:rPr>
-          <w:rFonts w:ascii="Cambria" w:hAnsi="Cambria" w:cs="Calibri"/>
-          <w:sz w:val="20"/>
-          <w:szCs w:val="20"/>
-        </w:rPr>
-        <w:t>Recreated Wordle’s game logic, including turn-based play and color-coded feedback for letter placement.</w:t>
-      </w:r>
-    </w:p>
-    <w:p>
-      <w:pPr>
-        <w:pStyle w:val="ListParagraph"/>
-        <w:numPr>
-          <w:ilvl w:val="0"/>
-          <w:numId w:val="8"/>
-        </w:numPr>
-        <w:tabs>
-          <w:tab w:val="right" w:pos="10773"/>
-        </w:tabs>
-        <w:ind w:left="426"/>
-        <w:contextualSpacing w:val="0"/>
-        <w:rPr>
-          <w:rFonts w:ascii="Cambria" w:hAnsi="Cambria" w:cs="Calibri"/>
-          <w:sz w:val="20"/>
-          <w:szCs w:val="20"/>
-        </w:rPr>
-      </w:pPr>
-      <w:r>
-        <w:rPr>
-          <w:rFonts w:ascii="Cambria" w:hAnsi="Cambria" w:cs="Calibri"/>
-          <w:sz w:val="20"/>
-          <w:szCs w:val="20"/>
-        </w:rPr>
-        <w:t>Developed an adaptive on-screen keyboard, enhancing accessibility for mobile and desktop users.</w:t>
-      </w:r>
-    </w:p>
-    <w:p>
-      <w:pPr>
-        <w:pStyle w:val="ListParagraph"/>
-        <w:numPr>
-          <w:ilvl w:val="0"/>
-          <w:numId w:val="8"/>
-        </w:numPr>
-        <w:tabs>
-          <w:tab w:val="right" w:pos="10773"/>
-        </w:tabs>
-        <w:spacing w:after="120"/>
-        <w:ind w:left="426"/>
-        <w:contextualSpacing w:val="0"/>
-        <w:rPr>
-          <w:rFonts w:ascii="Cambria" w:hAnsi="Cambria" w:cs="Calibri"/>
-          <w:sz w:val="20"/>
-          <w:szCs w:val="20"/>
-        </w:rPr>
-      </w:pPr>
-      <w:r>
-        <w:rPr>
-          <w:rFonts w:ascii="Cambria" w:hAnsi="Cambria" w:cs="Calibri"/>
-          <w:sz w:val="20"/>
-          <w:szCs w:val="20"/>
-        </w:rPr>
-        <w:t>Managed game state using React hooks, ensuring smooth and interactive gameplay.</w:t>
-      </w:r>
-    </w:p>
-    <w:p>
-      <w:pPr>
-        <w:pBdr>
-          <w:bottom w:val="single" w:sz="6" w:space="1" w:color="auto"/>
-        </w:pBdr>
-        <w:spacing w:after="120"/>
-        <w:rPr>
-          <w:rFonts w:ascii="Cambria" w:hAnsi="Cambria" w:cs="Calibri"/>
-          <w:b/>
-          <w:bCs/>
-        </w:rPr>
-      </w:pPr>
-      <w:r>
-        <w:rPr>
-          <w:rFonts w:ascii="Cambria" w:hAnsi="Cambria" w:cs="Calibri"/>
-          <w:b/>
-          <w:bCs/>
-        </w:rPr>
-        <w:t>Education</w:t>
-      </w:r>
-    </w:p>
-    <w:p>
-      <w:pPr>
-        <w:tabs>
-          <w:tab w:val="right" w:pos="10773"/>
-        </w:tabs>
-        <w:rPr>
-          <w:rFonts w:ascii="Cambria" w:hAnsi="Cambria" w:cs="Calibri"/>
-          <w:sz w:val="20"/>
-          <w:szCs w:val="20"/>
-        </w:rPr>
-      </w:pPr>
-      <w:hyperlink r:id="rId20" w:history="1">
-        <w:r>
-          <w:rPr>
-            <w:rStyle w:val="Hyperlink"/>
-            <w:rFonts w:ascii="Cambria" w:hAnsi="Cambria" w:cs="Calibri"/>
-            <w:b/>
-            <w:bCs/>
-            <w:sz w:val="20"/>
-            <w:szCs w:val="20"/>
           </w:rPr>
           <w:t>Computer Engineering Technology – Computer Science (Advanced Diploma)</w:t>
         </w:r>
@@ -1824,8 +940,6 @@
       <w:r>
         <w:rPr>
           <w:rFonts w:ascii="Cambria" w:hAnsi="Cambria" w:cs="Calibri"/>
-          <w:sz w:val="20"/>
-          <w:szCs w:val="20"/>
         </w:rPr>
         <w:tab/>
       </w:r>
@@ -1834,44 +948,8 @@
           <w:rFonts w:ascii="Cambria" w:hAnsi="Cambria" w:cs="Calibri"/>
           <w:i/>
           <w:iCs/>
-          <w:sz w:val="20"/>
-          <w:szCs w:val="20"/>
         </w:rPr>
         <w:t>Expected Graduation 2025</w:t>
-      </w:r>
-    </w:p>
-    <w:p>
-      <w:pPr>
-        <w:tabs>
-          <w:tab w:val="right" w:pos="10773"/>
-        </w:tabs>
-        <w:rPr>
-          <w:rFonts w:ascii="Cambria" w:hAnsi="Cambria" w:cs="Calibri"/>
-          <w:b/>
-          <w:bCs/>
-          <w:sz w:val="20"/>
-          <w:szCs w:val="20"/>
-        </w:rPr>
-      </w:pPr>
-      <w:r>
-        <w:rPr>
-          <w:rFonts w:ascii="Cambria" w:hAnsi="Cambria" w:cs="Calibri"/>
-          <w:b/>
-          <w:bCs/>
-          <w:sz w:val="20"/>
-          <w:szCs w:val="20"/>
-        </w:rPr>
-        <w:t>Algonquin College | Ottawa, ON</w:t>
-      </w:r>
-      <w:r>
-        <w:rPr>
-          <w:rFonts w:ascii="Cambria" w:hAnsi="Cambria" w:cs="Calibri"/>
-          <w:b/>
-          <w:bCs/>
-          <w:sz w:val="20"/>
-          <w:szCs w:val="20"/>
-        </w:rPr>
-        <w:tab/>
       </w:r>
     </w:p>
     <w:p>
@@ -1888,33 +966,98 @@
         <w:contextualSpacing w:val="0"/>
         <w:rPr>
           <w:rFonts w:ascii="Cambria" w:hAnsi="Cambria" w:cs="Calibri"/>
-          <w:sz w:val="20"/>
-          <w:szCs w:val="20"/>
-        </w:rPr>
-      </w:pPr>
-      <w:r>
-        <w:rPr>
-          <w:rFonts w:ascii="Cambria" w:hAnsi="Cambria" w:cs="Calibri"/>
-          <w:sz w:val="20"/>
-          <w:szCs w:val="20"/>
+        </w:rPr>
+      </w:pPr>
+      <w:r>
+        <w:rPr>
+          <w:rFonts w:ascii="Cambria" w:hAnsi="Cambria" w:cs="Calibri"/>
+          <w:b/>
+          <w:bCs/>
+        </w:rPr>
+        <w:t>Algonquin College | Ottawa, ON</w:t>
+      </w:r>
+      <w:r>
+        <w:rPr>
+          <w:rFonts w:ascii="Cambria" w:hAnsi="Cambria" w:cs="Calibri"/>
+          <w:b/>
+          <w:bCs/>
+        </w:rPr>
+        <w:t xml:space="preserve"> | </w:t>
+      </w:r>
+      <w:r>
+        <w:rPr>
+          <w:rFonts w:ascii="Cambria" w:hAnsi="Cambria" w:cs="Calibri"/>
+          <w:b/>
+          <w:bCs/>
         </w:rPr>
         <w:t>GPA</w:t>
       </w:r>
       <w:r>
         <w:rPr>
           <w:rFonts w:ascii="Cambria" w:hAnsi="Cambria" w:cs="Calibri"/>
-          <w:sz w:val="20"/>
-          <w:szCs w:val="20"/>
+          <w:b/>
+          <w:bCs/>
+        </w:rPr>
+        <w:t>:</w:t>
+      </w:r>
+      <w:r>
+        <w:rPr>
+          <w:rFonts w:ascii="Cambria" w:hAnsi="Cambria" w:cs="Calibri"/>
+          <w:b/>
+          <w:bCs/>
+        </w:rPr>
+        <w:t xml:space="preserve"> 3.76 / 4.0</w:t>
+      </w:r>
+      <w:r>
+        <w:rPr>
+          <w:rFonts w:ascii="Cambria" w:hAnsi="Cambria" w:cs="Calibri"/>
+          <w:b/>
+          <w:bCs/>
+        </w:rPr>
+        <w:tab/>
+      </w:r>
+    </w:p>
+    <w:p>
+      <w:pPr>
+        <w:pStyle w:val="ListParagraph"/>
+        <w:numPr>
+          <w:ilvl w:val="0"/>
+          <w:numId w:val="9"/>
+        </w:numPr>
+        <w:tabs>
+          <w:tab w:val="right" w:pos="10773"/>
+        </w:tabs>
+        <w:ind w:left="426"/>
+        <w:contextualSpacing w:val="0"/>
+        <w:rPr>
+          <w:rFonts w:ascii="Cambria" w:hAnsi="Cambria" w:cs="Calibri"/>
+        </w:rPr>
+      </w:pPr>
+      <w:r>
+        <w:rPr>
+          <w:rFonts w:ascii="Cambria" w:hAnsi="Cambria" w:cs="Calibri"/>
+          <w:b/>
+          <w:bCs/>
+        </w:rPr>
+        <w:t>Academic Honours</w:t>
+      </w:r>
+      <w:r>
+        <w:rPr>
+          <w:rFonts w:ascii="Cambria" w:hAnsi="Cambria" w:cs="Calibri"/>
         </w:rPr>
         <w:t xml:space="preserve">: </w:t>
       </w:r>
       <w:r>
         <w:rPr>
           <w:rFonts w:ascii="Cambria" w:hAnsi="Cambria" w:cs="Calibri"/>
-          <w:sz w:val="20"/>
-          <w:szCs w:val="20"/>
-        </w:rPr>
-        <w:t>3.76 / 4.0</w:t>
+        </w:rPr>
+        <w:t>Dean’s Honours List</w:t>
+      </w:r>
+      <w:r>
+        <w:rPr>
+          <w:rFonts w:ascii="Cambria" w:hAnsi="Cambria" w:cs="Calibri"/>
+        </w:rPr>
+        <w:t xml:space="preserve"> (All terms)</w:t>
       </w:r>
     </w:p>
     <w:p>
@@ -1932,17 +1075,19 @@
         <w:contextualSpacing w:val="0"/>
         <w:rPr>
           <w:rFonts w:ascii="Cambria" w:hAnsi="Cambria" w:cs="Calibri"/>
-          <w:sz w:val="20"/>
-          <w:szCs w:val="20"/>
-        </w:rPr>
-      </w:pPr>
-      <w:r>
-        <w:rPr>
-          <w:rFonts w:ascii="Cambria" w:hAnsi="Cambria" w:cs="Calibri"/>
-          <w:sz w:val="20"/>
-          <w:szCs w:val="20"/>
-        </w:rPr>
-        <w:t>Relevant Coursework: Web Programming, Data Structures, Object-Oriented Programming, Numerical Computing</w:t>
+        </w:rPr>
+      </w:pPr>
+      <w:r>
+        <w:rPr>
+          <w:rFonts w:ascii="Cambria" w:hAnsi="Cambria" w:cs="Calibri"/>
+        </w:rPr>
+        <w:t xml:space="preserve">Relevant Coursework: </w:t>
+      </w:r>
+      <w:r>
+        <w:rPr>
+          <w:rFonts w:ascii="Cambria" w:hAnsi="Cambria" w:cs="Calibri"/>
+        </w:rPr>
+        <w:t>Web Programming, Web Enterprise Applications, Data Structures, Software Design and Testing, Object-Oriented Programming</w:t>
       </w:r>
     </w:p>
     <w:sectPr>
@@ -3655,7 +2800,6 @@
   <w:style w:type="character" w:default="1" w:styleId="DefaultParagraphFont">
     <w:name w:val="Default Paragraph Font"/>
     <w:uiPriority w:val="1"/>
-    <w:semiHidden/>
     <w:unhideWhenUsed/>
   </w:style>
   <w:style w:type="table" w:default="1" w:styleId="TableNormal">

</xml_diff>